<commit_message>
Actualiza el documento de refactorizacion con el diagrama UML
Agrega la seccion Diagrama UML y marca como hechos el UML y el documento
de requerimientos en los pendientes.

Co-Authored-By: Claude Opus 5.5 <noreply@anthropic.com>
</commit_message>
<xml_diff>
--- a/docs/Refactorización FestivalCine — Code Smells, GRASP y SOLID.docx
+++ b/docs/Refactorización FestivalCine — Code Smells, GRASP y SOLID.docx
@@ -132,10 +132,10 @@
         <w:rPr>
           <w:rStyle w:val="CodeChar"/>
         </w:rPr>
-        <w:t xml:space="preserve">refactor/code-smells-grasp-solid</w:t>
-      </w:r>
-      <w:r>
-        <w:t xml:space="preserve"> del repositorio.</w:t>
+        <w:t xml:space="preserve">main</w:t>
+      </w:r>
+      <w:r>
+        <w:t xml:space="preserve"> del repositorio. La versión anterior al refactor queda guardada en la etiqueta entrega-original.</w:t>
       </w:r>
     </w:p>
     <w:p>
@@ -5938,22 +5938,416 @@
         <w:pStyle w:val="Heading2"/>
       </w:pPr>
       <w:r>
+        <w:t xml:space="preserve">Diagrama UML</w:t>
+      </w:r>
+    </w:p>
+    <w:p>
+      <w:pPr/>
+      <w:r>
+        <w:t xml:space="preserve">El diagrama de </w:t>
+      </w:r>
+      <w:r>
+        <w:rPr>
+          <w:rStyle w:val="CodeChar"/>
+        </w:rPr>
+        <w:t xml:space="preserve">uml/FestivalCine.mdj</w:t>
+      </w:r>
+      <w:r>
+        <w:t xml:space="preserve"> se regeneró a partir del código refactorizado, así que coincide con él clase por clase. Es un solo diagrama de clases con las 88 clases e interfaces del proyecto, más las 4 clases de Java de las que heredan.</w:t>
+      </w:r>
+    </w:p>
+    <w:tbl>
+      <w:tblPr>
+        <w:tblStyle w:val="TableGrid"/>
+        <w:tblW w:w="0" w:type="auto"/>
+        <w:tblLayout w:type="fixed"/>
+        <w:tblLook w:val="04A0" w:firstRow="1" w:lastRow="0" w:firstColumn="0" w:lastColumn="0" w:noHBand="0" w:noVBand="1"/>
+      </w:tblPr>
+      <w:tblGrid>
+        <w:gridCol w:w="3779"/>
+        <w:gridCol w:w="5580"/>
+      </w:tblGrid>
+      <w:tr>
+        <w:trPr>
+          <w:tblHeader/>
+        </w:trPr>
+        <w:tc>
+          <w:tcPr>
+            <w:tcW w:w="3779" w:type="dxa"/>
+            <w:shd w:val="clear" w:color="auto" w:fill="F2F2F2"/>
+          </w:tcPr>
+          <w:p>
+            <w:pPr/>
+            <w:r>
+              <w:t xml:space="preserve">Criterio</w:t>
+            </w:r>
+          </w:p>
+        </w:tc>
+        <w:tc>
+          <w:tcPr>
+            <w:tcW w:w="5580" w:type="dxa"/>
+            <w:shd w:val="clear" w:color="auto" w:fill="F2F2F2"/>
+          </w:tcPr>
+          <w:p>
+            <w:pPr/>
+            <w:r>
+              <w:t xml:space="preserve">Cómo quedó</w:t>
+            </w:r>
+          </w:p>
+        </w:tc>
+      </w:tr>
+      <w:tr>
+        <w:tc>
+          <w:tcPr>
+            <w:tcW w:w="3779" w:type="dxa"/>
+          </w:tcPr>
+          <w:p>
+            <w:pPr/>
+            <w:r>
+              <w:t xml:space="preserve">Líneas</w:t>
+            </w:r>
+          </w:p>
+        </w:tc>
+        <w:tc>
+          <w:tcPr>
+            <w:tcW w:w="5580" w:type="dxa"/>
+          </w:tcPr>
+          <w:p>
+            <w:pPr/>
+            <w:r>
+              <w:t xml:space="preserve">Las 99 relaciones usan el estilo rectilíneo de StarUML: solo tramos horizontales y verticales. Se verificó sobre el archivo: no hay ningún tramo en diagonal.</w:t>
+            </w:r>
+          </w:p>
+        </w:tc>
+      </w:tr>
+      <w:tr>
+        <w:tc>
+          <w:tcPr>
+            <w:tcW w:w="3779" w:type="dxa"/>
+          </w:tcPr>
+          <w:p>
+            <w:pPr/>
+            <w:r>
+              <w:t xml:space="preserve">Nombre de cada relación</w:t>
+            </w:r>
+          </w:p>
+        </w:tc>
+        <w:tc>
+          <w:tcPr>
+            <w:tcW w:w="5580" w:type="dxa"/>
+          </w:tcPr>
+          <w:p>
+            <w:pPr/>
+            <w:r>
+              <w:t xml:space="preserve">Las 47 asociaciones y las 5 dependencias tienen su palabra: </w:t>
+            </w:r>
+            <w:r>
+              <w:rPr>
+                <w:i/>
+              </w:rPr>
+              <w:t xml:space="preserve">organiza</w:t>
+            </w:r>
+            <w:r>
+              <w:t xml:space="preserve">, </w:t>
+            </w:r>
+            <w:r>
+              <w:rPr>
+                <w:i/>
+              </w:rPr>
+              <w:t xml:space="preserve">contiene</w:t>
+            </w:r>
+            <w:r>
+              <w:t xml:space="preserve">, </w:t>
+            </w:r>
+            <w:r>
+              <w:rPr>
+                <w:i/>
+              </w:rPr>
+              <w:t xml:space="preserve">es dirigida por</w:t>
+            </w:r>
+            <w:r>
+              <w:t xml:space="preserve">, </w:t>
+            </w:r>
+            <w:r>
+              <w:rPr>
+                <w:i/>
+              </w:rPr>
+              <w:t xml:space="preserve">reserva</w:t>
+            </w:r>
+            <w:r>
+              <w:t xml:space="preserve">, </w:t>
+            </w:r>
+            <w:r>
+              <w:rPr>
+                <w:i/>
+              </w:rPr>
+              <w:t xml:space="preserve">se realiza en</w:t>
+            </w:r>
+            <w:r>
+              <w:t xml:space="preserve">, </w:t>
+            </w:r>
+            <w:r>
+              <w:rPr>
+                <w:i/>
+              </w:rPr>
+              <w:t xml:space="preserve">aplica</w:t>
+            </w:r>
+            <w:r>
+              <w:t xml:space="preserve">, </w:t>
+            </w:r>
+            <w:r>
+              <w:rPr>
+                <w:i/>
+              </w:rPr>
+              <w:t xml:space="preserve">crea</w:t>
+            </w:r>
+            <w:r>
+              <w:t xml:space="preserve">, etc.</w:t>
+            </w:r>
+          </w:p>
+        </w:tc>
+      </w:tr>
+      <w:tr>
+        <w:tc>
+          <w:tcPr>
+            <w:tcW w:w="3779" w:type="dxa"/>
+          </w:tcPr>
+          <w:p>
+            <w:pPr/>
+            <w:r>
+              <w:t xml:space="preserve">Herencia e interfaces</w:t>
+            </w:r>
+          </w:p>
+        </w:tc>
+        <w:tc>
+          <w:tcPr>
+            <w:tcW w:w="5580" w:type="dxa"/>
+          </w:tcPr>
+          <w:p>
+            <w:pPr/>
+            <w:r>
+              <w:t xml:space="preserve">Las 35 herencias y las 12 implementaciones de interfaz (</w:t>
+            </w:r>
+            <w:r>
+              <w:rPr>
+                <w:rStyle w:val="CodeChar"/>
+              </w:rPr>
+              <w:t xml:space="preserve">Repositorio</w:t>
+            </w:r>
+            <w:r>
+              <w:t xml:space="preserve">, </w:t>
+            </w:r>
+            <w:r>
+              <w:rPr>
+                <w:rStyle w:val="CodeChar"/>
+              </w:rPr>
+              <w:t xml:space="preserve">Persistencia</w:t>
+            </w:r>
+            <w:r>
+              <w:t xml:space="preserve">, </w:t>
+            </w:r>
+            <w:r>
+              <w:rPr>
+                <w:rStyle w:val="CodeChar"/>
+              </w:rPr>
+              <w:t xml:space="preserve">ReglaDescuento</w:t>
+            </w:r>
+            <w:r>
+              <w:t xml:space="preserve">, </w:t>
+            </w:r>
+            <w:r>
+              <w:rPr>
+                <w:rStyle w:val="CodeChar"/>
+              </w:rPr>
+              <w:t xml:space="preserve">Inicializador</w:t>
+            </w:r>
+            <w:r>
+              <w:t xml:space="preserve">) usan su notación de flecha con triángulo.</w:t>
+            </w:r>
+          </w:p>
+        </w:tc>
+      </w:tr>
+      <w:tr>
+        <w:tc>
+          <w:tcPr>
+            <w:tcW w:w="3779" w:type="dxa"/>
+          </w:tcPr>
+          <w:p>
+            <w:pPr/>
+            <w:r>
+              <w:t xml:space="preserve">Multiplicidad y navegabilidad</w:t>
+            </w:r>
+          </w:p>
+        </w:tc>
+        <w:tc>
+          <w:tcPr>
+            <w:tcW w:w="5580" w:type="dxa"/>
+          </w:tcPr>
+          <w:p>
+            <w:pPr/>
+            <w:r>
+              <w:t xml:space="preserve">Cada asociación indica su multiplicidad (</w:t>
+            </w:r>
+            <w:r>
+              <w:rPr>
+                <w:rStyle w:val="CodeChar"/>
+              </w:rPr>
+              <w:t xml:space="preserve">1</w:t>
+            </w:r>
+            <w:r>
+              <w:t xml:space="preserve">, </w:t>
+            </w:r>
+            <w:r>
+              <w:rPr>
+                <w:rStyle w:val="CodeChar"/>
+              </w:rPr>
+              <w:t xml:space="preserve">0..*</w:t>
+            </w:r>
+            <w:r>
+              <w:t xml:space="preserve">) y la flecha muestra hacia dónde se navega.</w:t>
+            </w:r>
+          </w:p>
+        </w:tc>
+      </w:tr>
+      <w:tr>
+        <w:tc>
+          <w:tcPr>
+            <w:tcW w:w="3779" w:type="dxa"/>
+          </w:tcPr>
+          <w:p>
+            <w:pPr/>
+            <w:r>
+              <w:t xml:space="preserve">Clases vacías</w:t>
+            </w:r>
+          </w:p>
+        </w:tc>
+        <w:tc>
+          <w:tcPr>
+            <w:tcW w:w="5580" w:type="dxa"/>
+          </w:tcPr>
+          <w:p>
+            <w:pPr/>
+            <w:r>
+              <w:t xml:space="preserve">Ninguna clase del proyecto se muestra vacía, y no hay elementos del modelo sin su vista en el diagrama (el problema de la entrega anterior). Solo quedan sin miembros </w:t>
+            </w:r>
+            <w:r>
+              <w:rPr>
+                <w:rStyle w:val="CodeChar"/>
+              </w:rPr>
+              <w:t xml:space="preserve">JPanel</w:t>
+            </w:r>
+            <w:r>
+              <w:t xml:space="preserve">, </w:t>
+            </w:r>
+            <w:r>
+              <w:rPr>
+                <w:rStyle w:val="CodeChar"/>
+              </w:rPr>
+              <w:t xml:space="preserve">JFrame</w:t>
+            </w:r>
+            <w:r>
+              <w:t xml:space="preserve">, </w:t>
+            </w:r>
+            <w:r>
+              <w:rPr>
+                <w:rStyle w:val="CodeChar"/>
+              </w:rPr>
+              <w:t xml:space="preserve">Exception</w:t>
+            </w:r>
+            <w:r>
+              <w:t xml:space="preserve"> y </w:t>
+            </w:r>
+            <w:r>
+              <w:rPr>
+                <w:rStyle w:val="CodeChar"/>
+              </w:rPr>
+              <w:t xml:space="preserve">RuntimeException</w:t>
+            </w:r>
+            <w:r>
+              <w:t xml:space="preserve">, marcadas como "from javax.swing" / "from java.lang".</w:t>
+            </w:r>
+          </w:p>
+        </w:tc>
+      </w:tr>
+      <w:tr>
+        <w:tc>
+          <w:tcPr>
+            <w:tcW w:w="3779" w:type="dxa"/>
+          </w:tcPr>
+          <w:p>
+            <w:pPr/>
+            <w:r>
+              <w:t xml:space="preserve">Qué se muestra</w:t>
+            </w:r>
+          </w:p>
+        </w:tc>
+        <w:tc>
+          <w:tcPr>
+            <w:tcW w:w="5580" w:type="dxa"/>
+          </w:tcPr>
+          <w:p>
+            <w:pPr/>
+            <w:r>
+              <w:t xml:space="preserve">Atributos y métodos no privados. No se muestran getters triviales ni </w:t>
+            </w:r>
+            <w:r>
+              <w:rPr>
+                <w:rStyle w:val="CodeChar"/>
+              </w:rPr>
+              <w:t xml:space="preserve">toString()</w:t>
+            </w:r>
+            <w:r>
+              <w:t xml:space="preserve">. Una referencia a una clase de otro paquete se muestra como atributo con su tipo (por ejemplo </w:t>
+            </w:r>
+            <w:r>
+              <w:rPr>
+                <w:rStyle w:val="CodeChar"/>
+              </w:rPr>
+              <w:t xml:space="preserve">-sistema: SistemaFestival</w:t>
+            </w:r>
+            <w:r>
+              <w:t xml:space="preserve">), para no cruzar líneas por todo el diagrama.</w:t>
+            </w:r>
+          </w:p>
+        </w:tc>
+      </w:tr>
+      <w:tr>
+        <w:tc>
+          <w:tcPr>
+            <w:tcW w:w="3779" w:type="dxa"/>
+          </w:tcPr>
+          <w:p>
+            <w:pPr/>
+            <w:r>
+              <w:t xml:space="preserve">Organización</w:t>
+            </w:r>
+          </w:p>
+        </w:tc>
+        <w:tc>
+          <w:tcPr>
+            <w:tcW w:w="5580" w:type="dxa"/>
+          </w:tcPr>
+          <w:p>
+            <w:pPr/>
+            <w:r>
+              <w:t xml:space="preserve">Las clases de cada paquete están juntas en el diagrama.</w:t>
+            </w:r>
+          </w:p>
+        </w:tc>
+      </w:tr>
+    </w:tbl>
+    <w:p>
+      <w:pPr>
+        <w:pStyle w:val="Heading2"/>
+      </w:pPr>
+      <w:r>
         <w:t xml:space="preserve">Decisiones y pendientes</w:t>
       </w:r>
     </w:p>
     <w:p>
       <w:pPr/>
       <w:r>
-        <w:t xml:space="preserve">El diagrama UML (</w:t>
-      </w:r>
-      <w:r>
-        <w:rPr>
-          <w:rStyle w:val="CodeChar"/>
-        </w:rPr>
-        <w:t xml:space="preserve">uml/FestivalCine.mdj</w:t>
-      </w:r>
-      <w:r>
-        <w:t xml:space="preserve">) quedó desactualizado y hay que rehacerlo antes de entregar.</w:t>
+        <w:t xml:space="preserve">El diagrama UML y el documento de requerimientos ya están actualizados con la estructura nueva. Solo falta probar la aplicación a mano antes de entregar.</w:t>
       </w:r>
     </w:p>
     <w:p>
@@ -6252,43 +6646,7 @@
         </w:numPr>
       </w:pPr>
       <w:r>
-        <w:t xml:space="preserve">☐ Actualizar el diagrama UML con los paquetes nuevos (</w:t>
-      </w:r>
-      <w:r>
-        <w:rPr>
-          <w:rStyle w:val="CodeChar"/>
-        </w:rPr>
-        <w:t xml:space="preserve">repositorio</w:t>
-      </w:r>
-      <w:r>
-        <w:t xml:space="preserve">, </w:t>
-      </w:r>
-      <w:r>
-        <w:rPr>
-          <w:rStyle w:val="CodeChar"/>
-        </w:rPr>
-        <w:t xml:space="preserve">inicializacion</w:t>
-      </w:r>
-      <w:r>
-        <w:t xml:space="preserve">, </w:t>
-      </w:r>
-      <w:r>
-        <w:rPr>
-          <w:rStyle w:val="CodeChar"/>
-        </w:rPr>
-        <w:t xml:space="preserve">servicios.precios</w:t>
-      </w:r>
-      <w:r>
-        <w:t xml:space="preserve">, </w:t>
-      </w:r>
-      <w:r>
-        <w:rPr>
-          <w:rStyle w:val="CodeChar"/>
-        </w:rPr>
-        <w:t xml:space="preserve">ui.comun</w:t>
-      </w:r>
-      <w:r>
-        <w:t xml:space="preserve">) y las clases nuevas.</w:t>
+        <w:t xml:space="preserve">☒ Actualizar el diagrama UML con los paquetes y las clases nuevas (sección Diagrama UML).</w:t>
       </w:r>
     </w:p>
     <w:p>
@@ -6300,7 +6658,7 @@
         </w:numPr>
       </w:pPr>
       <w:r>
-        <w:t xml:space="preserve">☐ Actualizar la sección 8 (Modelo de clases) del documento de requerimientos.</w:t>
+        <w:t xml:space="preserve">☒ Actualizar el documento de requerimientos: reglas de negocio, RN-29 nueva, RNF-03 y secciones 6, 7 y 8.</w:t>
       </w:r>
     </w:p>
     <w:p>

</xml_diff>